<commit_message>
docs: settle the ep-evtmon hash by measuring it again
The frozen-build record wrote 15 hex digits for ep-evtmon, so the
deployment manual's 16-digit value looked like a typo. Re-ran sha256sum
against /root/epv2-build on SP3: the binary is 2752282392b50f9b…, the
evidence table was truncated, and the other five artifacts match their
recorded prefixes. Appended as §6 rather than editing the 10-25 table.
</commit_message>
<xml_diff>
--- a/docs/EulerPilot-v2部署文档-v1.1.docx
+++ b/docs/EulerPilot-v2部署文档-v1.1.docx
@@ -2287,7 +2287,7 @@
               <w:rPr>
                 <w:rStyle w:val="VerbatimChar"/>
               </w:rPr>
-              <w:t xml:space="preserve">2752282392b50f9</w:t>
+              <w:t xml:space="preserve">2752282392b50f9b</w:t>
             </w:r>
           </w:p>
         </w:tc>
@@ -2799,7 +2799,25 @@
         <w:rPr>
           <w:rFonts w:hint="eastAsia"/>
         </w:rPr>
-        <w:t xml:space="preserve">哈希以证据文件记录为准;若发现位数不一致以</w:t>
+        <w:t xml:space="preserve">的哈希已于</w:t>
+      </w:r>
+      <w:r>
+        <w:t xml:space="preserve"> 2026-10-26 </w:t>
+      </w:r>
+      <w:r>
+        <w:rPr>
+          <w:rFonts w:hint="eastAsia"/>
+        </w:rPr>
+        <w:t xml:space="preserve">在</w:t>
+      </w:r>
+      <w:r>
+        <w:t xml:space="preserve"> SP3 </w:t>
+      </w:r>
+      <w:r>
+        <w:rPr>
+          <w:rFonts w:hint="eastAsia"/>
+        </w:rPr>
+        <w:t xml:space="preserve">上用</w:t>
       </w:r>
       <w:r>
         <w:t xml:space="preserve"> </w:t>
@@ -2808,6 +2826,33 @@
         <w:rPr>
           <w:rStyle w:val="VerbatimChar"/>
         </w:rPr>
+        <w:t xml:space="preserve">sha256sum</w:t>
+      </w:r>
+      <w:r>
+        <w:t xml:space="preserve"> </w:t>
+      </w:r>
+      <w:r>
+        <w:rPr>
+          <w:rFonts w:hint="eastAsia"/>
+        </w:rPr>
+        <w:t xml:space="preserve">逐项复核,64</w:t>
+      </w:r>
+      <w:r>
+        <w:t xml:space="preserve"> </w:t>
+      </w:r>
+      <w:r>
+        <w:rPr>
+          <w:rFonts w:hint="eastAsia"/>
+        </w:rPr>
+        <w:t xml:space="preserve">位全值见</w:t>
+      </w:r>
+      <w:r>
+        <w:t xml:space="preserve"> </w:t>
+      </w:r>
+      <w:r>
+        <w:rPr>
+          <w:rStyle w:val="VerbatimChar"/>
+        </w:rPr>
         <w:t xml:space="preserve">evidence/p1/frozen-build-20261025.txt</w:t>
       </w:r>
       <w:r>
@@ -2817,7 +2862,55 @@
         <w:rPr>
           <w:rFonts w:hint="eastAsia"/>
         </w:rPr>
-        <w:t xml:space="preserve">为权威。</w:t>
+        <w:t xml:space="preserve">§6;其中</w:t>
+      </w:r>
+      <w:r>
+        <w:t xml:space="preserve"> </w:t>
+      </w:r>
+      <w:r>
+        <w:rPr>
+          <w:rStyle w:val="VerbatimChar"/>
+        </w:rPr>
+        <w:t xml:space="preserve">ep-evtmon</w:t>
+      </w:r>
+      <w:r>
+        <w:t xml:space="preserve"> </w:t>
+      </w:r>
+      <w:r>
+        <w:rPr>
+          <w:rFonts w:hint="eastAsia"/>
+        </w:rPr>
+        <w:t xml:space="preserve">在</w:t>
+      </w:r>
+      <w:r>
+        <w:t xml:space="preserve"> 10-25 </w:t>
+      </w:r>
+      <w:r>
+        <w:rPr>
+          <w:rFonts w:hint="eastAsia"/>
+        </w:rPr>
+        <w:t xml:space="preserve">的记录里被截断了一位,实测第</w:t>
+      </w:r>
+      <w:r>
+        <w:t xml:space="preserve"> 16 </w:t>
+      </w:r>
+      <w:r>
+        <w:rPr>
+          <w:rFonts w:hint="eastAsia"/>
+        </w:rPr>
+        <w:t xml:space="preserve">位为</w:t>
+      </w:r>
+      <w:r>
+        <w:t xml:space="preserve"> </w:t>
+      </w:r>
+      <w:r>
+        <w:rPr>
+          <w:rStyle w:val="VerbatimChar"/>
+        </w:rPr>
+        <w:t xml:space="preserve">b</w:t>
+      </w:r>
+      <w:r>
+        <w:t xml:space="preserve">。</w:t>
       </w:r>
     </w:p>
     <w:bookmarkEnd w:id="12"/>

</xml_diff>